<commit_message>
Part 2: fact-check corrections applied; front and back matter drafts
</commit_message>
<xml_diff>
--- a/books/emergency-medicine/previews/ch02.docx
+++ b/books/emergency-medicine/previews/ch02.docx
@@ -64,7 +64,7 @@
         <w:pStyle w:val="Compact"/>
       </w:pPr>
       <w:r>
-        <w:t xml:space="preserve">Recognize respiratory distress and respiratory failure and state first priorities for asthma, COPD and pneumonia.</w:t>
+        <w:t xml:space="preserve">Recognize respiratory distress and respiratory failure and state first priorities for asthma, chronic obstructive pulmonary disease (COPD) and pneumonia.</w:t>
       </w:r>
     </w:p>
     <w:p>
@@ -84,7 +84,7 @@
         <w:pStyle w:val="FirstParagraph"/>
       </w:pPr>
       <w:r>
-        <w:t xml:space="preserve">A patient can survive a long time without food and a good while without a heartbeat if someone is pumping the chest. Without air reaching the lungs, the margin is measured in minutes. That is why airway and breathing come first in the primary survey of Entry 1.3, and why this Part comes next.</w:t>
+        <w:t xml:space="preserve">A patient can go for days without food, but only minutes without air reaching the lungs and the brain. That is why airway and breathing come first in the primary survey of Entry 1.3, and why this Part comes next.</w:t>
       </w:r>
     </w:p>
     <w:p>
@@ -137,15 +137,15 @@
         <w:t xml:space="preserve"> </w:t>
       </w:r>
       <w:r>
-        <w:t xml:space="preserve">Air enters through the nose and mouth and passes into the throat, called the pharynx. Below the throat sits the larynx, or voice box, guarded by a flap of tissue called the epiglottis that covers the entrance when you swallow. Below the larynx the windpipe, or trachea, runs down into the chest and divides into the two main bronchi, which branch into ever smaller tubes inside the lungs. The part above the larynx is the upper airway, and most emergency airway care is aimed there, because it is the part you can reach and open.</w:t>
-      </w:r>
-    </w:p>
-    <w:p>
-      <w:pPr>
-        <w:pStyle w:val="BodyText"/>
-      </w:pPr>
-      <w:r>
-        <w:t xml:space="preserve">Figure 5 shows these structures and the landmarks you use.</w:t>
+        <w:t xml:space="preserve">Air enters through the nose and mouth and passes into the throat, called the pharynx. Below the throat sits the larynx, or voice box, guarded by a flap of tissue called the epiglottis that covers the entrance when you swallow. Below the larynx the windpipe, or trachea, runs down into the chest and divides into the two main bronchi, which branch into ever smaller tubes inside the lungs. The part from the nose down to and including the larynx is the upper airway, and most emergency airway care is aimed there, because it is the part you can reach and open.</w:t>
+      </w:r>
+    </w:p>
+    <w:p>
+      <w:pPr>
+        <w:pStyle w:val="BodyText"/>
+      </w:pPr>
+      <w:r>
+        <w:t xml:space="preserve">Figure 5 shows these structures; notice the order from nose to windpipe.</w:t>
       </w:r>
     </w:p>
     <w:p>
@@ -157,7 +157,7 @@
           <wp:inline>
             <wp:extent cx="5334000" cy="2715490"/>
             <wp:effectExtent b="0" l="0" r="0" t="0"/>
-            <wp:docPr descr="Figure 5. The upper airway from nose and mouth to the windpipe, with the structures that most often narrow or block it." title="" id="21" name="Picture"/>
+            <wp:docPr descr="Figure 5. The upper airway from nose and mouth to the windpipe, with the main structures labelled." title="" id="21" name="Picture"/>
             <a:graphic>
               <a:graphicData uri="http://schemas.openxmlformats.org/drawingml/2006/picture">
                 <pic:pic>
@@ -219,7 +219,7 @@
         <w:t xml:space="preserve"> </w:t>
       </w:r>
       <w:r>
-        <w:t xml:space="preserve">The upper airway from nose and mouth to the windpipe, with the structures that most often narrow or block it.</w:t>
+        <w:t xml:space="preserve">The upper airway from nose and mouth to the windpipe, with the main structures labelled.</w:t>
       </w:r>
     </w:p>
     <w:p>
@@ -247,7 +247,7 @@
         <w:t xml:space="preserve"> </w:t>
       </w:r>
       <w:r>
-        <w:t xml:space="preserve">Five causes account for most emergencies. In an unconscious patient lying on the back, the tongue and soft tissues of the throat can fall backward and close the passage, and this is the commonest cause of obstruction in a patient with a depressed level of consciousness. Food or a foreign object can lodge in the throat. Fluid, vomit or blood can fill the airway. Swelling from an allergic reaction, infection, a burn or an injury can narrow it from within. A direct injury to the face or neck can distort it. Each cause points to a different first action, which is why the next entry is organized by cause and not by technique.</w:t>
+        <w:t xml:space="preserve">Five causes are common. In an unconscious patient lying on the back, the tongue and soft tissues of the throat can fall backward and close the passage, and this is the most common cause of obstruction in an unconscious patient. Food or a foreign object can lodge in the throat. Fluid, vomit or blood can fill the airway. Swelling from an allergic reaction, infection, a burn or an injury can narrow it from within. A direct injury to the face or neck can distort it. Each cause points to a different first action, which is why the next entry is organized by cause and not by technique.</w:t>
       </w:r>
     </w:p>
     <w:p>
@@ -261,7 +261,7 @@
         <w:t xml:space="preserve"> </w:t>
       </w:r>
       <w:r>
-        <w:t xml:space="preserve">Look, listen and feel, as in the primary survey. Ask the patient a simple question. A patient who answers in a normal voice has an open airway for the moment. Then watch the chest and abdomen, listen for sounds, and feel for air at the mouth and nose.</w:t>
+        <w:t xml:space="preserve">Entry 1.3 introduced looking, listening and feeling; here each finding is tied to a cause. Ask the patient a simple question. A patient who answers in a normal voice has an open airway for the moment. Then watch the chest and abdomen, listen for sounds, and feel for air at the mouth and nose.</w:t>
       </w:r>
     </w:p>
     <w:p>
@@ -348,7 +348,7 @@
               <w:jc w:val="left"/>
             </w:pPr>
             <w:r>
-              <w:t xml:space="preserve">Hoarse or whispered voice</w:t>
+              <w:t xml:space="preserve">Very hoarse or whispered voice</w:t>
             </w:r>
           </w:p>
         </w:tc>
@@ -505,7 +505,7 @@
         <w:t xml:space="preserve"> </w:t>
       </w:r>
       <w:r>
-        <w:t xml:space="preserve">Assess the airway first and again after every change in the patient, treat obstruction as an emergency, call for help early, and do not delay action while waiting for a blue tint to appear.</w:t>
+        <w:t xml:space="preserve">Assess the airway first and again after every change in the patient, and treat obstruction as an emergency without waiting for a blue tint.</w:t>
       </w:r>
     </w:p>
     <w:p>
@@ -547,7 +547,7 @@
         <w:pStyle w:val="FirstParagraph"/>
       </w:pPr>
       <w:r>
-        <w:t xml:space="preserve">The simple measures in this entry can be done with few or no tools, and they solve most airway problems you will meet before advanced help arrives. They follow the cause. If the tongue has fallen back, you reposition. If there is fluid, you suction. If there is a solid object, you relieve choking. If there is swelling, you call for help and treat the cause, as Entry 2.5 describes for allergic swelling.</w:t>
+        <w:t xml:space="preserve">The simple measures in this entry can be done with few or no tools, and they address the most common airway problems before advanced help arrives. They follow the cause. If the tongue has fallen back, you reposition. If there is fluid, you suction. If there is a solid object, you relieve choking. If there is swelling, you call for help and treat the cause, as Entry 2.5 describes for allergic swelling.</w:t>
       </w:r>
     </w:p>
     <w:p>
@@ -597,7 +597,7 @@
         <w:pStyle w:val="BodyText"/>
       </w:pPr>
       <w:r>
-        <w:t xml:space="preserve">Figure 6 compares the two positions.</w:t>
+        <w:t xml:space="preserve">Figure 6 compares the two positions; notice that the jaw thrust leaves the head in line with the body.</w:t>
       </w:r>
     </w:p>
     <w:p>
@@ -685,7 +685,7 @@
         <w:t xml:space="preserve"> </w:t>
       </w:r>
       <w:r>
-        <w:t xml:space="preserve">Suction removes liquid and small particles from the mouth and throat. Use it only when you can see or hear fluid, apply it in short bursts and not continuously, and stop to check the patient’s breathing and condition between bursts, because suction also removes air. Follow the device maker’s instructions and your protocol for how long and how deep.</w:t>
+        <w:t xml:space="preserve">Suction removes liquid and small particles from the mouth and throat. Use it only when you can see or hear fluid, apply it in short bursts, and stop to check the patient’s breathing and condition between bursts, because suction can lower the patient’s oxygen level. Follow the device maker’s instructions and your protocol for how long and how deep.</w:t>
       </w:r>
     </w:p>
     <w:p>
@@ -773,7 +773,7 @@
         <w:pStyle w:val="Compact"/>
       </w:pPr>
       <w:r>
-        <w:t xml:space="preserve">If the patient is breathing normally and not injured, and you must leave or cannot stay with them, place them on their side in the recovery position; otherwise keep them on the back with the airway held open.</w:t>
+        <w:t xml:space="preserve">If the patient is breathing normally and you do not suspect an injury, place them on their side in the recovery position; if you suspect an injury, leave them in the position you found them, hold the airway open with the jaw thrust, and move them only as your protocol directs.</w:t>
       </w:r>
     </w:p>
     <w:p>
@@ -813,7 +813,7 @@
         <w:pStyle w:val="BodyText"/>
       </w:pPr>
       <w:r>
-        <w:t xml:space="preserve">Do not put your fingers blindly into a patient’s mouth. Never leave an unresponsive patient alone, and do not move a patient with a possible neck injury unless the scene is unsafe or you must move them to give life-saving care, as your protocol directs.</w:t>
+        <w:t xml:space="preserve">Do not put your fingers blindly into a patient’s mouth. Stay with an unresponsive patient, and do not move a patient with a possible neck injury unless the scene is unsafe or your protocol directs a move to give urgent care, and then keep the head, neck and body in line as far as you can.</w:t>
       </w:r>
     </w:p>
     <w:p>
@@ -839,7 +839,7 @@
         <w:pStyle w:val="BodyText"/>
       </w:pPr>
       <w:r>
-        <w:t xml:space="preserve">These steps work in a fixed order because each one answers what the last one found. Positioning solves the common problem first, the fallen tongue. Clearing the mouth solves the second most common. Checking breathing then tells you whether the patient needs only an open airway or needs breathing support as well.</w:t>
+        <w:t xml:space="preserve">These steps work in a fixed order because each one answers what the last one found. Positioning solves the common problem first, the fallen tongue. Clearing the mouth then deals with fluid or debris. Checking breathing then tells you whether the patient needs only an open airway or needs breathing support as well.</w:t>
       </w:r>
     </w:p>
     <w:p>
@@ -853,7 +853,7 @@
         <w:t xml:space="preserve"> </w:t>
       </w:r>
       <w:r>
-        <w:t xml:space="preserve">A patient who is breathing normally but is unresponsive, and who has no suspected neck or spinal injury, is at risk from their own tongue and from vomit. Placing them on their side lets fluid drain from the mouth and keeps the tongue forward. Kneel beside the patient, place the arm nearest you at a right angle to the body, bring the far arm across the chest and hold the back of that hand against the near cheek, bend the far knee, and roll the patient toward you by pulling on that knee. Adjust the top leg so that the hip and knee are bent at right angles and tilt the head back slightly so the airway stays open. Check breathing again at once and keep checking. The position is for a patient who is breathing normally; a patient who is not breathing normally needs CPR, not repositioning, and a patient with a possible spinal injury is moved only as your protocol directs.</w:t>
+        <w:t xml:space="preserve">A patient who is breathing normally but is unresponsive, and who has no suspected neck or spinal injury, is at risk from their own tongue and from vomit. Placing them on their side lets fluid drain from the mouth and keeps the tongue forward. Kneel beside the patient, place the arm nearest you at a right angle to the body, bring the far arm across the chest and hold the back of that hand against the near cheek, bend the far knee, and roll the patient toward you by pulling on that knee. Adjust the top leg so that the hip and knee are bent at right angles and tilt the head back slightly so the airway stays open. Check breathing again at once and keep checking. The position is for a patient who is breathing normally; a patient who is not breathing normally needs CPR, and a patient with a possible spinal injury is moved only as your protocol directs.</w:t>
       </w:r>
     </w:p>
     <w:p>
@@ -867,7 +867,7 @@
         <w:t xml:space="preserve"> </w:t>
       </w:r>
       <w:r>
-        <w:t xml:space="preserve">Choking is a solid object blocking the airway. A patient with a partial blockage can still cough, speak or breathe with effort, and you should encourage coughing and stay close without hitting them. A patient with a severe blockage cannot speak, cough or breathe, may clutch the throat, and may turn blue or gray. That patient needs immediate help. Ask</w:t>
+        <w:t xml:space="preserve">Choking is a solid object blocking the airway. A patient with a partial blockage can still cough, speak or breathe with effort, and you should encourage coughing and stay close and do not interfere while the cough is forceful. A patient with a severe blockage cannot speak, cough or breathe, may clutch the throat, and may turn blue or gray. That patient needs immediate help. Ask</w:t>
       </w:r>
       <w:r>
         <w:t xml:space="preserve"> </w:t>
@@ -967,7 +967,7 @@
         <w:pStyle w:val="Compact"/>
       </w:pPr>
       <w:r>
-        <w:t xml:space="preserve">Give up to five firm blows between the shoulder blades with the heel of your other hand.</w:t>
+        <w:t xml:space="preserve">Give up to 5 firm blows between the shoulder blades with the heel of your other hand.</w:t>
       </w:r>
     </w:p>
     <w:p>
@@ -979,7 +979,7 @@
         <w:pStyle w:val="Compact"/>
       </w:pPr>
       <w:r>
-        <w:t xml:space="preserve">If the object is still stuck, stand behind the person, place a fist just above the navel, and give up to five quick inward and upward abdominal thrusts.</w:t>
+        <w:t xml:space="preserve">If the object is still stuck, stand behind the person, place a fist just above the navel, and give up to 5 quick inward and upward abdominal thrusts.</w:t>
       </w:r>
     </w:p>
     <w:p>
@@ -1003,7 +1003,7 @@
         <w:pStyle w:val="Compact"/>
       </w:pPr>
       <w:r>
-        <w:t xml:space="preserve">If the person becomes unresponsive, lower them carefully to the ground, call for help, and begin CPR (Entry 3.4).</w:t>
+        <w:t xml:space="preserve">If the person becomes unresponsive, lower them carefully to the ground, call for help, and begin CPR, starting with chest compressions (Entry 3.4).</w:t>
       </w:r>
     </w:p>
     <w:p>
@@ -1015,7 +1015,7 @@
         <w:pStyle w:val="Compact"/>
       </w:pPr>
       <w:r>
-        <w:t xml:space="preserve">Even if the object comes out, the person should be checked by a clinician.</w:t>
+        <w:t xml:space="preserve">Stay with the person, keep watching them until help arrives, and have a clinician check them, even if the object comes out.</w:t>
       </w:r>
     </w:p>
     <w:p>
@@ -1031,7 +1031,33 @@
         <w:pStyle w:val="BodyText"/>
       </w:pPr>
       <w:r>
-        <w:t xml:space="preserve">Abdominal thrusts can injure internal organs. For a person who is visibly pregnant or too large to reach around, your training may direct chest thrusts instead. Do not use abdominal thrusts on infants; Entry 6.2 covers them.</w:t>
+        <w:t xml:space="preserve">Abdominal thrusts can injure internal organs. For a person who is in the late stages of pregnancy or too large to reach around, your training may direct chest thrusts instead. Do not use abdominal thrusts on infants; Entry 6.2 covers them.</w:t>
+      </w:r>
+    </w:p>
+    <w:p>
+      <w:pPr>
+        <w:pStyle w:val="BodyText"/>
+      </w:pPr>
+      <w:r>
+        <w:rPr>
+          <w:bCs/>
+          <w:b/>
+        </w:rPr>
+        <w:t xml:space="preserve">Stop and call for help if</w:t>
+      </w:r>
+      <w:r>
+        <w:t xml:space="preserve"> </w:t>
+      </w:r>
+      <w:r>
+        <w:t xml:space="preserve">the object does not come out, the person cannot breathe or turns blue or gray, or the person becomes unresponsive.</w:t>
+      </w:r>
+    </w:p>
+    <w:p>
+      <w:pPr>
+        <w:pStyle w:val="BodyText"/>
+      </w:pPr>
+      <w:r>
+        <w:t xml:space="preserve">The two techniques use different forces. Back blows strike the upper back to dislodge the object, and abdominal thrusts raise the pressure in the chest so that air pushes the object upward. Current guidance has you alternate them until the object comes out or the person becomes unresponsive.</w:t>
       </w:r>
     </w:p>
     <w:p>
@@ -1045,7 +1071,7 @@
         <w:t xml:space="preserve"> </w:t>
       </w:r>
       <w:r>
-        <w:t xml:space="preserve">Match the action to the cause, open the airway first, suction only when you can see or hear fluid, relieve choking in the order you were taught, begin CPR if a choking patient becomes unresponsive, never leave an unresponsive patient alone, and recheck the airway after every move.</w:t>
+        <w:t xml:space="preserve">Match the action to the cause, open the airway first, and suction only when you can see or hear fluid. Stay with an unresponsive patient and recheck the airway after every move.</w:t>
       </w:r>
     </w:p>
     <w:p>
@@ -1087,7 +1113,7 @@
         <w:pStyle w:val="FirstParagraph"/>
       </w:pPr>
       <w:r>
-        <w:t xml:space="preserve">Sometimes the airway is open and the patient still is not moving enough air. Breathing may be too slow, too shallow or absent. At that point a trained responder moves air for the patient with a bag-valve-mask, often connected to oxygen. This entry explains the device, the steps, and the oxygen devices you may meet. It gives device types and when they are used, and no flow-rate figures.</w:t>
+        <w:t xml:space="preserve">Sometimes the airway is open and the patient still is not moving enough air. Breathing may be too slow, too shallow or absent. At that point a trained responder moves air for the patient with a bag-valve-mask, often connected to oxygen. This entry explains the device, the steps, and the oxygen devices you may meet. It names the device types and when each is used; your protocol sets the flow.</w:t>
       </w:r>
     </w:p>
     <w:p>
@@ -1115,7 +1141,7 @@
         <w:t xml:space="preserve"> </w:t>
       </w:r>
       <w:r>
-        <w:t xml:space="preserve">Moving air by hand is a skill that looks easy and is not. A poor seal lets air escape. Squeezing too hard or too fast can push air into the stomach and cause vomiting. A technique that moves the chest well on a manikin may fail on a patient with a beard, a small mouth or a swollen face. Practice on manikins, under supervision, is what turns a clumsy first attempt into a reliable one.</w:t>
+        <w:t xml:space="preserve">Moving air by hand is a skill that takes practice. A poor seal lets air escape. Squeezing too hard or too fast can push air into the stomach which raises the risk of vomiting. A technique that moves the chest well on a manikin may fail on a patient with a beard or a swollen face. Practice on manikins, under supervision, comes first.</w:t>
       </w:r>
     </w:p>
     <w:p>
@@ -1129,15 +1155,15 @@
         <w:t xml:space="preserve"> </w:t>
       </w:r>
       <w:r>
-        <w:t xml:space="preserve">Choose a mask that covers the nose and mouth without pressing on the eyes. With two people, one holds the mask with both hands, keeping the airway open with the jaw thrust or head tilt, while the other squeezes the bag. With one person, the single hand and the bag are harder to manage, and the seal is the usual point of failure. Squeeze gently and just enough to make the chest rise, then release and let the chest fall. Watching the chest, not counting squeezes, tells you whether air is going in.</w:t>
-      </w:r>
-    </w:p>
-    <w:p>
-      <w:pPr>
-        <w:pStyle w:val="BodyText"/>
-      </w:pPr>
-      <w:r>
-        <w:t xml:space="preserve">Figure 7 shows the two-hand mask seal.</w:t>
+        <w:t xml:space="preserve">Choose a mask that covers the nose and mouth without pressing on the eyes. With two people, one holds the mask with both hands, keeping the airway open with the jaw thrust or head tilt, while the other squeezes the bag. With one person, the single hand and the bag are harder to manage, and the seal is the usual point of failure. Squeeze gently and just enough to make the chest rise, then release and let the chest fall. Watching the chest tells you whether air is going in.</w:t>
+      </w:r>
+    </w:p>
+    <w:p>
+      <w:pPr>
+        <w:pStyle w:val="BodyText"/>
+      </w:pPr>
+      <w:r>
+        <w:t xml:space="preserve">Figure 7 shows the two-hand mask seal; notice how the fingers lift the jaw toward the mask.</w:t>
       </w:r>
     </w:p>
     <w:p>
@@ -1149,7 +1175,7 @@
           <wp:inline>
             <wp:extent cx="5334000" cy="4018280"/>
             <wp:effectExtent b="0" l="0" r="0" t="0"/>
-            <wp:docPr descr="Figure 7. A two-hand mask seal with a second person squeezing the bag." title="" id="29" name="Picture"/>
+            <wp:docPr descr="Figure 7. A two-hand mask seal with a second person squeezing the bag (eye protection not drawn)." title="" id="29" name="Picture"/>
             <a:graphic>
               <a:graphicData uri="http://schemas.openxmlformats.org/drawingml/2006/picture">
                 <pic:pic>
@@ -1211,15 +1237,15 @@
         <w:t xml:space="preserve"> </w:t>
       </w:r>
       <w:r>
-        <w:t xml:space="preserve">A two-hand mask seal with a second person squeezing the bag.</w:t>
-      </w:r>
-    </w:p>
-    <w:p>
-      <w:pPr>
-        <w:pStyle w:val="BodyText"/>
-      </w:pPr>
-      <w:r>
-        <w:t xml:space="preserve">For an adult who has a pulse but is not breathing normally, a common rule is one breath about every six seconds, which is about ten breaths a minute. Your protocol sets the rate you follow, and the rate for a child or infant differs.</w:t>
+        <w:t xml:space="preserve">A two-hand mask seal with a second person squeezing the bag (eye protection not drawn).</w:t>
+      </w:r>
+    </w:p>
+    <w:p>
+      <w:pPr>
+        <w:pStyle w:val="BodyText"/>
+      </w:pPr>
+      <w:r>
+        <w:t xml:space="preserve">For an adult who has a pulse but is not breathing normally, a common rule is 1 breath about every 6 seconds, or about 10 breaths a minute. Your protocol sets the rate you follow, and the rate for a child or infant differs.</w:t>
       </w:r>
     </w:p>
     <w:p>
@@ -1379,7 +1405,7 @@
         <w:t xml:space="preserve"> </w:t>
       </w:r>
       <w:r>
-        <w:t xml:space="preserve">Judge each breath by its effect, not by the count. The chest should rise gently and fall fully as the bag is released. You should feel little resistance in the bag and see no air escaping around the mask. A good response may include improved skin color and, in a patient with a pulse oximeter, a rising reading, though that takes time. If the chest does not rise, reposition the head and jaw, reseat the mask, and check for an obstruction before squeezing harder. Increasing force is almost never the answer.</w:t>
+        <w:t xml:space="preserve">The chest should rise gently and fall fully as the bag is released. You should see no air escaping around the mask. A good response may include improved skin color and, in a patient with a pulse oximeter, a rising reading, though that takes time. If the chest does not rise, reposition the head and jaw, reseat the mask, and check for an obstruction before squeezing harder. Squeezing harder risks inflating the stomach.</w:t>
       </w:r>
     </w:p>
     <w:p>
@@ -1393,7 +1419,7 @@
         <w:t xml:space="preserve"> </w:t>
       </w:r>
       <w:r>
-        <w:t xml:space="preserve">Oxygen can be given by several devices, chosen by how much the patient needs and by the patient’s ability to breathe. A nasal cannula is a soft tube with two short prongs that rest in the nostrils, used for patients who are breathing well and need a small boost. A simple face mask covers the nose and mouth and is used when a moderate increase is needed. A non-rebreather mask has a bag, called a reservoir, that fills with oxygen so that the patient breathes in almost pure oxygen, and it is used for the sickest breathing patients. A BVM can be connected to oxygen and to a reservoir to deliver the highest concentration to a patient who cannot breathe for themselves. Your protocol and medical direction set the choice, the flow, and the target for each patient. Giving oxygen is part of the care of many roles, but giving medicines is outside many roles; follow your scope and medical direction.</w:t>
+        <w:t xml:space="preserve">Oxygen can be given by several devices, chosen by how much the patient needs and by the patient’s ability to breathe. A nasal cannula is a soft tube with two short prongs that rest in the nostrils, used for patients who are breathing well and need a small boost. A simple face mask covers the nose and mouth and is used when a moderate increase is needed. A non-rebreather mask has a bag, called a reservoir, that fills with oxygen so that the patient breathes in a high concentration of oxygen, and it is used for the sickest breathing patients. A BVM connected to oxygen, with a reservoir attached where one is fitted, delivers the highest concentration to a patient who cannot breathe for themselves. Your protocol and medical direction set the choice, the flow, and the target for each patient. Oxygen is treated as a medicine in the United States. Giving medicines is outside many roles; follow your scope and medical direction.</w:t>
       </w:r>
     </w:p>
     <w:p>
@@ -1407,7 +1433,7 @@
         <w:t xml:space="preserve"> </w:t>
       </w:r>
       <w:r>
-        <w:t xml:space="preserve">Open and clear the airway before ventilating, make a firm seal, give gentle breaths until the chest rises, use two people when you can, keep oxygen away from flame, and recheck after every change.</w:t>
+        <w:t xml:space="preserve">Open and clear the airway before you ventilate, make a firm seal, and give gentle breaths until the chest rises.</w:t>
       </w:r>
     </w:p>
     <w:p>
@@ -1449,7 +1475,7 @@
         <w:pStyle w:val="FirstParagraph"/>
       </w:pPr>
       <w:r>
-        <w:t xml:space="preserve">Breathing difficulty is one of the commonest reasons people call for help, and its causes range from a minor chest cold to a life-threatening attack. This entry gives you a way to judge how serious it is and covers three common causes.</w:t>
+        <w:t xml:space="preserve">Breathing difficulty is one of the most common reasons people call for help, and its causes range from a minor chest cold to a life-threatening attack. This entry gives you a way to judge how serious it is and covers three common causes.</w:t>
       </w:r>
     </w:p>
     <w:p>
@@ -1463,7 +1489,7 @@
         <w:t xml:space="preserve"> </w:t>
       </w:r>
       <w:r>
-        <w:t xml:space="preserve">Respiratory distress is difficult or labored breathing. Respiratory failure is the stage at which breathing can no longer meet the body’s needs, and it can follow distress quickly, particularly in a tiring patient. Signs of distress include sweating, using the neck and shoulder muscles to breathe, belly breathing, and a gray or blue tint to the lips. A rate that is high or rising is a warning. Signs of failure include drowsiness or confusion, a rate that is slowing in a tiring patient, a very quiet chest in a patient who was wheezing, and blue lips.</w:t>
+        <w:t xml:space="preserve">Respiratory distress is difficult or labored breathing. Respiratory failure is the stage at which breathing can no longer meet the body’s needs, and it can follow distress quickly, particularly in a tiring patient. Signs of distress include sweating, using the neck and shoulder muscles to breathe, and belly breathing. A rate that is high or rising is a warning, and Entry 1.4 gave typical resting values. Signs of failure include drowsiness or confusion, weak or tiring breathing effort, a very quiet chest in a patient who was wheezing, and blue lips.</w:t>
       </w:r>
     </w:p>
     <w:p>
@@ -1477,7 +1503,7 @@
         <w:t xml:space="preserve"> </w:t>
       </w:r>
       <w:r>
-        <w:t xml:space="preserve">A patient who is working hard to breathe can tire, and a tiring patient can stop. The signs of tiring are subtle: the patient becomes calmer and quieter, which is easy to mistake for improvement. Reassessing breathing rate, effort and mental state at short intervals is what catches the change.</w:t>
+        <w:t xml:space="preserve">A patient who is working hard to breathe can tire, and a tiring patient can stop. The signs of tiring are subtle: the patient becomes calmer and quieter, which is easy to mistake for improvement. Reassessing breathing rate, effort and mental state at short intervals catches the change.</w:t>
       </w:r>
     </w:p>
     <w:p>
@@ -1491,7 +1517,7 @@
         <w:t xml:space="preserve"> </w:t>
       </w:r>
       <w:r>
-        <w:t xml:space="preserve">Because the patient’s condition can change quickly, set a rhythm for rechecking. Each time, note the breathing rate, how many words the patient can say at once, whether the neck and shoulder muscles are working, the color of the lips and the level of alertness. Write each set down with the time, as Entry 1.5 describes. A patient who needs more help than before is worsening even if each single number looks acceptable. A patient who is tiring will often change position, lean forward on outstretched arms and start to say fewer words. Let the pattern guide your call for help.</w:t>
+        <w:t xml:space="preserve">Because the patient’s condition can change quickly, set a rhythm for rechecking. Each time, note the breathing rate, how many words the patient can say at once, whether the neck and shoulder muscles are working, the color of the lips and the level of alertness. Write each set down with the time, as Entry 1.5 describes. A patient who needs more help than before is worsening even if each single number looks acceptable. A patient who is tiring may change position, lean forward on outstretched arms and start to say fewer words.</w:t>
       </w:r>
     </w:p>
     <w:p>
@@ -1505,7 +1531,7 @@
         <w:t xml:space="preserve"> </w:t>
       </w:r>
       <w:r>
-        <w:t xml:space="preserve">Asthma is a long-term condition in which the airways narrow, tighten and become inflamed in response to triggers such as allergens, infection, exercise or cold air. In an attack, the patient may wheeze, cough, feel tightness in the chest, and struggle to breathe. Many patients carry a reliever inhaler containing albuterol (salbutamol). Giving medicines is outside many roles; follow your scope and medical direction. A severe attack is shown by speaking only a few words at a time, a high breathing rate, visible effort, a very quiet chest, drowsiness, or no improvement after the patient’s usual reliever. Sit the patient upright, keep them calm, call for help, and help them use their own inhaler as they have been taught and as your protocol allows.</w:t>
+        <w:t xml:space="preserve">Asthma is a long-term condition in which the airways narrow, tighten and become inflamed in response to triggers such as allergens, infection, exercise or cold air. In an attack, the patient may wheeze, cough, feel tightness in the chest, and struggle to breathe. Many patients carry a reliever inhaler containing albuterol (salbutamol). A severe attack is shown by speaking only a few words at a time, a high breathing rate, visible effort, a very quiet chest, drowsiness, or no improvement after the patient’s usual reliever. Sit the patient upright, keep them calm, call for help, and help them use their own inhaler as they have been taught and as your protocol allows. Giving medicines is outside many roles; follow your scope and medical direction.</w:t>
       </w:r>
     </w:p>
     <w:p>
@@ -1519,7 +1545,7 @@
         <w:t xml:space="preserve"> </w:t>
       </w:r>
       <w:r>
-        <w:t xml:space="preserve">Chronic obstructive pulmonary disease, written COPD, is a long-term lung disease, often caused by smoking, in which the airways are narrowed and the lungs are damaged. Patients are short of breath on effort, cough, and bring up mucus, and they have flare-ups called exacerbations. Oxygen needs special care here. In some patients with COPD, a high concentration of oxygen can depress breathing, so these patients need a lower oxygen target set by protocol or medical direction. Give oxygen as directed and watch breathing closely; do not withhold oxygen from a patient who needs it.</w:t>
+        <w:t xml:space="preserve">COPD is a long-term lung disease, often caused by smoking, in which the airways are narrowed and the lungs are damaged. Patients are short of breath on effort, cough, and bring up mucus, and they have flare-ups called exacerbations. Oxygen needs special care here. In some patients with COPD, a high concentration of oxygen can slow breathing and let carbon dioxide build up, so these patients need a lower oxygen target set by protocol or medical direction. Give oxygen only as your scope and medical direction allow, and watch breathing closely; do not withhold oxygen from a patient who needs it. Giving medicines is outside many roles; follow your scope and medical direction.</w:t>
       </w:r>
     </w:p>
     <w:p>
@@ -1533,7 +1559,15 @@
         <w:t xml:space="preserve"> </w:t>
       </w:r>
       <w:r>
-        <w:t xml:space="preserve">Pneumonia is an infection of the lungs. It causes fever, cough, sometimes chest pain on breathing in, and a fast, shallow breathing rate. In older adults or very ill patients it may cause confusion without much cough or fever. Pneumonia can lead to sepsis, which Entry 5.4 covers. First priorities are an upright or comfortable position, oxygen as directed, early reassessment, and a call for help if breathing is hard, the patient is confused, or the lips are blue.</w:t>
+        <w:t xml:space="preserve">Pneumonia is an infection of the lungs. It causes fever, cough, sometimes chest pain on breathing in, and a fast breathing rate. In older adults or very ill patients it may cause confusion without much cough or fever. Pneumonia can lead to sepsis, which Entry 5.4 covers. Confusion with poor breathing is a warning of its own, and Entry 5.1 returns to it. First priorities are an upright or comfortable position, oxygen as directed, early reassessment, and a call for help if breathing is hard, the patient is confused, or the lips are blue.</w:t>
+      </w:r>
+    </w:p>
+    <w:p>
+      <w:pPr>
+        <w:pStyle w:val="BodyText"/>
+      </w:pPr>
+      <w:r>
+        <w:t xml:space="preserve">Figure 8 sets the same priorities out as a flow: judge severity first, and note that the severe branch calls for help before anything else.</w:t>
       </w:r>
     </w:p>
     <w:p>
@@ -1623,7 +1657,7 @@
         <w:pStyle w:val="BodyText"/>
       </w:pPr>
       <w:r>
-        <w:t xml:space="preserve">Speaking only a few words at a time, a very fast or slowing breathing rate, blue or gray lips, drowsiness or new confusion, a chest that has gone quiet, or a patient who becomes calmer without improving. Call for help at once.</w:t>
+        <w:t xml:space="preserve">Speaking only a few words at a time, a very fast breathing rate, weak or tiring effort, blue or gray lips, drowsiness or new confusion, a chest that has gone quiet, or a patient who becomes calmer without improving. Call for help at once.</w:t>
       </w:r>
     </w:p>
     <w:p>
@@ -1653,7 +1687,7 @@
         <w:t xml:space="preserve"> </w:t>
       </w:r>
       <w:r>
-        <w:t xml:space="preserve">Judge severity by effort, speech, color and mental state, position the patient upright, call early for help, give oxygen as your protocol directs with care for patients who have long-term lung disease, and reassess often because a quiet patient may be a tiring one.</w:t>
+        <w:t xml:space="preserve">Judge severity by effort, speech, color and mental state, call early for help, and reassess often because a quiet patient may be a tiring one.</w:t>
       </w:r>
     </w:p>
     <w:p>
@@ -1695,7 +1729,7 @@
         <w:pStyle w:val="FirstParagraph"/>
       </w:pPr>
       <w:r>
-        <w:t xml:space="preserve">Anaphylaxis is a severe allergic reaction that affects the whole body and can be fatal. It tends to arrive fast, often within seconds or minutes of contact with the trigger, and it can close the airway, drop the blood pressure, or both. A bystander with no medical training may be the first person to treat it, which is why this short entry matters more than its length suggests.</w:t>
+        <w:t xml:space="preserve">Anaphylaxis is a severe allergic reaction that affects the whole body and can be fatal. It tends to arrive fast, often within seconds or minutes of contact with the trigger, and it can close the airway, drop the blood pressure, or both. A bystander with no medical training may be the first person to treat it.</w:t>
       </w:r>
     </w:p>
     <w:p>
@@ -1709,7 +1743,7 @@
         <w:t xml:space="preserve"> </w:t>
       </w:r>
       <w:r>
-        <w:t xml:space="preserve">In anaphylaxis, the immune system reacts to a substance it has become sensitive to, such as an insect sting, a food or a medicine, and releases chemicals that cause the airways to tighten and the blood vessels to widen. Common triggers are foods, insect stings and medicines. Some people have a reaction with no known cause.</w:t>
+        <w:t xml:space="preserve">In anaphylaxis, the immune system reacts to a substance it has become sensitive to, such as an insect sting, a food or a medicine, and releases chemicals that cause the airways to tighten and the blood vessels to widen. Some people have a reaction with no known cause.</w:t>
       </w:r>
     </w:p>
     <w:p>
@@ -1737,7 +1771,23 @@
         <w:t xml:space="preserve"> </w:t>
       </w:r>
       <w:r>
-        <w:t xml:space="preserve">Symptoms can involve several body systems at once. They include hives, itching or redness of the skin, swelling of the face, eyes or tongue, difficulty breathing, wheezing, a tight chest, a hoarse or whispered voice, difficulty swallowing, abdominal pain, vomiting, dizziness or fainting, and a sense of doom. A warning sign of dangerous throat swelling is a very hoarse voice or coarse noise on breathing in. When a person has a known allergy and develops breathing difficulty, throat swelling or faintness soon after exposure, treat it as anaphylaxis.</w:t>
+        <w:t xml:space="preserve">Symptoms can involve several body systems at once. They include hives, itching or redness of the skin, swelling of the face, eyes or tongue, difficulty breathing, wheezing, a tight chest, a hoarse or whispered voice, difficulty swallowing, abdominal pain, vomiting, dizziness or fainting, and anxiety. A warning sign of dangerous throat swelling is a very hoarse voice or coarse noise on breathing in. When a person has a known allergy and develops breathing difficulty, throat swelling or faintness soon after exposure, treat it as anaphylaxis.</w:t>
+      </w:r>
+    </w:p>
+    <w:p>
+      <w:pPr>
+        <w:pStyle w:val="BodyText"/>
+      </w:pPr>
+      <w:r>
+        <w:t xml:space="preserve">Red Flags</w:t>
+      </w:r>
+    </w:p>
+    <w:p>
+      <w:pPr>
+        <w:pStyle w:val="BodyText"/>
+      </w:pPr>
+      <w:r>
+        <w:t xml:space="preserve">A very hoarse or whispered voice, noisy breathing in, swelling of the tongue or face, difficulty breathing, faintness or collapse, or symptoms that follow a known trigger within minutes. Call emergency services at once.</w:t>
       </w:r>
     </w:p>
     <w:p>
@@ -1791,7 +1841,7 @@
         <w:pStyle w:val="Compact"/>
       </w:pPr>
       <w:r>
-        <w:t xml:space="preserve">Ask whether they carry an auto-injector, and find it.</w:t>
+        <w:t xml:space="preserve">Ask whether they carry an auto-injector, and find it; if there is none, do not delay the call, and keep checking breathing and consciousness.</w:t>
       </w:r>
     </w:p>
     <w:p>
@@ -1839,7 +1889,7 @@
         <w:pStyle w:val="Compact"/>
       </w:pPr>
       <w:r>
-        <w:t xml:space="preserve">Place the patient in the position that suits their breathing: lying flat with legs raised if they are faint, or sitting up if breathing is hard.</w:t>
+        <w:t xml:space="preserve">Place the patient in the position that suits their breathing: lying flat with legs raised if they are faint, sitting up if breathing is hard, or on the side if vomiting.</w:t>
       </w:r>
     </w:p>
     <w:p>
@@ -1879,7 +1929,7 @@
         <w:pStyle w:val="BodyText"/>
       </w:pPr>
       <w:r>
-        <w:t xml:space="preserve">Do not give anything by mouth if the person has trouble breathing. Do not put a pillow under the head of a person who has trouble breathing. Do not assume earlier allergy shots give full protection. Used needles must go in a sharps container; keep your fingers away from the needle end of the device.</w:t>
+        <w:t xml:space="preserve">Do not give anything by mouth to a person who has trouble breathing. Keep your fingers away from the needle end of the device, and put the used device in a sharps container.</w:t>
       </w:r>
     </w:p>
     <w:p>
@@ -1905,7 +1955,7 @@
         <w:pStyle w:val="BodyText"/>
       </w:pPr>
       <w:r>
-        <w:t xml:space="preserve">The steps follow the logic of the problem. Anaphylaxis is a race between a reaction that is accelerating and a treatment that takes effect in minutes, so the first moves are to bring help and the treatment together. Position protects the airway and the blood pressure, and the notation of time lets the next team judge what to do.</w:t>
+        <w:t xml:space="preserve">The steps follow the logic of the problem. Anaphylaxis is a race between a reaction that is accelerating and a treatment that works quickly, so the first moves are to bring help and the treatment together. Entry 3.5 explains how a fall in blood pressure becomes shock. Position protects the airway and the blood pressure, and the recorded time lets the next team judge the response.</w:t>
       </w:r>
     </w:p>
     <w:p>
@@ -1919,7 +1969,7 @@
         <w:t xml:space="preserve"> </w:t>
       </w:r>
       <w:r>
-        <w:t xml:space="preserve">Recognize the pattern early, call for help at once, help the patient use their own epinephrine auto-injector as the device directs, position the patient for breathing or faintness, never give food or drink, and keep reassessing until a clinician takes over.</w:t>
+        <w:t xml:space="preserve">Recognize the pattern early, call for help at once, help the patient use their own auto-injector as the device directs, and keep reassessing until a clinician takes over.</w:t>
       </w:r>
     </w:p>
     <w:p>
@@ -1963,7 +2013,7 @@
         <w:pStyle w:val="BodyText"/>
       </w:pPr>
       <w:r>
-        <w:t xml:space="preserve">Marcus was a first-year paramedic student helping at a weekend youth camp with the camp nurse, Dana. During an afternoon game, a fourteen-year-old camper named Leo sat down on the grass and said he could not catch his breath. Marcus reached him first, checked that the area was clear, and put on gloves.</w:t>
+        <w:t xml:space="preserve">Marcus was a first-year paramedic student helping at a weekend youth camp with the camp nurse, Dana. During an afternoon game, a 14-year-old camper named Leo sat down on the grass and said he could not catch his breath. Marcus reached him first, checked that the area was clear, and put on gloves.</w:t>
       </w:r>
     </w:p>
     <w:p>
@@ -1979,7 +2029,7 @@
         <w:pStyle w:val="BodyText"/>
       </w:pPr>
       <w:r>
-        <w:t xml:space="preserve">Marcus told Dana what he saw while she fetched the inhaler and the camp’s first-aid kit. He kept Leo sitting upright, spoke slowly, and counted his breathing rate again two minutes later. It had not changed. Dana arrived, helped Leo use his own inhaler as he had been taught, and told Marcus to keep watching his color and how much he could say. When Leo said a full sentence, they relaxed a little. Dana still called for the camp doctor, because the breathing had not settled and a night in the cabin would be unsafe without an assessment.</w:t>
+        <w:t xml:space="preserve">Marcus told Dana what he saw, and she sent a counselor for the inhaler and called emergency services at once. He kept Leo sitting upright, spoke slowly, and counted his breathing rate at the start and again 2 minutes later. It had not changed. The inhaler arrived, Dana helped Leo use it as he had been taught, and she told Marcus to keep watching his color and how much he could say. When Leo managed a full sentence, they relaxed a little. When the paramedics arrived, Dana handed over what Marcus had counted and the time of the inhaler. Leo was taken in for an assessment, because his breathing had not settled.</w:t>
       </w:r>
     </w:p>
     <w:bookmarkEnd w:id="37"/>
@@ -2005,7 +2055,7 @@
         <w:pStyle w:val="BodyText"/>
       </w:pPr>
       <w:r>
-        <w:t xml:space="preserve">When breathing is failing, the airway comes before anything else, and a patient who cannot get air in cannot be helped by a device that moves air out. Position before equipment: a tongue that has fallen back needs a hand, not a machine. A patient who is working hard to breathe needs help before they tire, so treat effort as a warning even when the oxygen reading looks fair. When a trigger is known, remove it, but never at the cost of delaying a call for help. In anaphylaxis, bring the call and the treatment together, because every minute of delay lets the reaction advance. If a skill in this Part is outside your scope, say so and keep the patient’s airway open until someone trained arrives.</w:t>
+        <w:t xml:space="preserve">When two airway or breathing problems compete, treat the one that stops air first: an obstruction before a wheeze, and a wheeze before a low reading. Use your hands before equipment, because repositioning is quicker than fetching equipment. Treat effort as an early warning, since a patient who has stopped struggling may be tiring rather than recovering. Ask for help before the patient needs it, and say in one sentence what you see, what you have done and what you need. Decide before you start a skill what you will do if it fails, so that a failure does not surprise you at the bedside.</w:t>
       </w:r>
     </w:p>
     <w:bookmarkEnd w:id="38"/>
@@ -2075,7 +2125,7 @@
         <w:pStyle w:val="Compact"/>
       </w:pPr>
       <w:r>
-        <w:t xml:space="preserve">Anxiety only.</w:t>
+        <w:t xml:space="preserve">A strong cough reflex.</w:t>
       </w:r>
     </w:p>
     <w:p>
@@ -2087,7 +2137,7 @@
         <w:pStyle w:val="Compact"/>
       </w:pPr>
       <w:r>
-        <w:t xml:space="preserve">Which position is preferred for opening the airway of an unresponsive patient with a possible neck injury?</w:t>
+        <w:t xml:space="preserve">Which technique is preferred for opening the airway of an unresponsive patient with a possible neck injury?</w:t>
       </w:r>
     </w:p>
     <w:p>
@@ -2099,7 +2149,7 @@
         <w:pStyle w:val="Compact"/>
       </w:pPr>
       <w:r>
-        <w:t xml:space="preserve">Head-tilt chin-lift.</w:t>
+        <w:t xml:space="preserve">Jaw thrust.</w:t>
       </w:r>
     </w:p>
     <w:p>
@@ -2111,7 +2161,7 @@
         <w:pStyle w:val="Compact"/>
       </w:pPr>
       <w:r>
-        <w:t xml:space="preserve">Sitting upright.</w:t>
+        <w:t xml:space="preserve">Sitting the patient upright.</w:t>
       </w:r>
     </w:p>
     <w:p>
@@ -2123,7 +2173,7 @@
         <w:pStyle w:val="Compact"/>
       </w:pPr>
       <w:r>
-        <w:t xml:space="preserve">Jaw thrust.</w:t>
+        <w:t xml:space="preserve">Head-tilt chin-lift.</w:t>
       </w:r>
     </w:p>
     <w:p>
@@ -2135,7 +2185,7 @@
         <w:pStyle w:val="Compact"/>
       </w:pPr>
       <w:r>
-        <w:t xml:space="preserve">Face down.</w:t>
+        <w:t xml:space="preserve">Rolling the patient face down.</w:t>
       </w:r>
     </w:p>
     <w:p>
@@ -2171,7 +2221,7 @@
         <w:pStyle w:val="Compact"/>
       </w:pPr>
       <w:r>
-        <w:t xml:space="preserve">When you can see or hear fluid in the mouth or throat.</w:t>
+        <w:t xml:space="preserve">Only after the patient wakes up.</w:t>
       </w:r>
     </w:p>
     <w:p>
@@ -2183,7 +2233,7 @@
         <w:pStyle w:val="Compact"/>
       </w:pPr>
       <w:r>
-        <w:t xml:space="preserve">Only after the patient wakes up.</w:t>
+        <w:t xml:space="preserve">Before checking for a response.</w:t>
       </w:r>
     </w:p>
     <w:p>
@@ -2195,7 +2245,7 @@
         <w:pStyle w:val="Compact"/>
       </w:pPr>
       <w:r>
-        <w:t xml:space="preserve">Before checking for a response.</w:t>
+        <w:t xml:space="preserve">When you can see or hear fluid in the mouth or throat.</w:t>
       </w:r>
     </w:p>
     <w:p>
@@ -2219,7 +2269,7 @@
         <w:pStyle w:val="Compact"/>
       </w:pPr>
       <w:r>
-        <w:t xml:space="preserve">Give a drink of water.</w:t>
+        <w:t xml:space="preserve">Ask the person to lie down and rest.</w:t>
       </w:r>
     </w:p>
     <w:p>
@@ -2255,7 +2305,7 @@
         <w:pStyle w:val="Compact"/>
       </w:pPr>
       <w:r>
-        <w:t xml:space="preserve">Lay the person flat and begin chest compressions at once.</w:t>
+        <w:t xml:space="preserve">Begin chest compressions at once.</w:t>
       </w:r>
     </w:p>
     <w:p>
@@ -2279,7 +2329,7 @@
         <w:pStyle w:val="Compact"/>
       </w:pPr>
       <w:r>
-        <w:t xml:space="preserve">The mask will fall off.</w:t>
+        <w:t xml:space="preserve">Air can enter the stomach which raises the risk of vomiting.</w:t>
       </w:r>
     </w:p>
     <w:p>
@@ -2303,7 +2353,7 @@
         <w:pStyle w:val="Compact"/>
       </w:pPr>
       <w:r>
-        <w:t xml:space="preserve">Air can enter the stomach and cause vomiting.</w:t>
+        <w:t xml:space="preserve">The mask will fall off.</w:t>
       </w:r>
     </w:p>
     <w:p>
@@ -2315,7 +2365,7 @@
         <w:pStyle w:val="Compact"/>
       </w:pPr>
       <w:r>
-        <w:t xml:space="preserve">The patient will wake up.</w:t>
+        <w:t xml:space="preserve">The patient will start breathing normally at once.</w:t>
       </w:r>
     </w:p>
     <w:p>
@@ -2327,7 +2377,7 @@
         <w:pStyle w:val="Compact"/>
       </w:pPr>
       <w:r>
-        <w:t xml:space="preserve">A patient with severe asthma becomes quieter and calmer but still has blue lips and cannot speak more than a word. What does this suggest?</w:t>
+        <w:t xml:space="preserve">A patient with severe asthma becomes quieter and calmer but still has blue lips and can say only a word. What does this suggest?</w:t>
       </w:r>
     </w:p>
     <w:p>
@@ -2351,7 +2401,7 @@
         <w:pStyle w:val="Compact"/>
       </w:pPr>
       <w:r>
-        <w:t xml:space="preserve">The patient is tiring and may be failing.</w:t>
+        <w:t xml:space="preserve">The patient needs only reassurance.</w:t>
       </w:r>
     </w:p>
     <w:p>
@@ -2363,7 +2413,7 @@
         <w:pStyle w:val="Compact"/>
       </w:pPr>
       <w:r>
-        <w:t xml:space="preserve">The patient is faking.</w:t>
+        <w:t xml:space="preserve">Nothing needs to change.</w:t>
       </w:r>
     </w:p>
     <w:p>
@@ -2375,7 +2425,7 @@
         <w:pStyle w:val="Compact"/>
       </w:pPr>
       <w:r>
-        <w:t xml:space="preserve">Nothing needs to change.</w:t>
+        <w:t xml:space="preserve">The patient is tiring and may be failing.</w:t>
       </w:r>
     </w:p>
     <w:p>
@@ -2399,7 +2449,7 @@
         <w:pStyle w:val="Compact"/>
       </w:pPr>
       <w:r>
-        <w:t xml:space="preserve">Take a photograph of the sting.</w:t>
+        <w:t xml:space="preserve">Wash the area and watch for an hour.</w:t>
       </w:r>
     </w:p>
     <w:p>
@@ -2411,7 +2461,7 @@
         <w:pStyle w:val="Compact"/>
       </w:pPr>
       <w:r>
-        <w:t xml:space="preserve">Give food to restore strength.</w:t>
+        <w:t xml:space="preserve">Call emergency services and help a patient who carries one use their own epinephrine auto-injector.</w:t>
       </w:r>
     </w:p>
     <w:p>
@@ -2423,7 +2473,7 @@
         <w:pStyle w:val="Compact"/>
       </w:pPr>
       <w:r>
-        <w:t xml:space="preserve">Call emergency services and help with the patient’s own epinephrine auto-injector.</w:t>
+        <w:t xml:space="preserve">Give a drink to restore strength.</w:t>
       </w:r>
     </w:p>
     <w:p>
@@ -2447,7 +2497,7 @@
         <w:pStyle w:val="Compact"/>
       </w:pPr>
       <w:r>
-        <w:t xml:space="preserve">Short case. A patient with long-term lung disease has become short of breath at home and is drowsy. List, in order, the first four things you would do and explain why oxygen needs care in this patient.</w:t>
+        <w:t xml:space="preserve">Short case. A patient with COPD has become short of breath at home and is drowsy. List, in order, the first four things you would do and explain why oxygen needs care in this patient.</w:t>
       </w:r>
     </w:p>
     <w:bookmarkEnd w:id="39"/>

</xml_diff>